<commit_message>
docs: completar correos de cuentas en el reparto de trabajo
</commit_message>
<xml_diff>
--- a/REPARTO_FRONTEND.docx
+++ b/REPARTO_FRONTEND.docx
@@ -779,7 +779,7 @@
           </w:tcPr>
           <w:p>
             <w:r>
-              <w:t>(pendiente)</w:t>
+              <w:t>(nombre por confirmar)</w:t>
             </w:r>
           </w:p>
         </w:tc>
@@ -789,7 +789,7 @@
           </w:tcPr>
           <w:p>
             <w:r>
-              <w:t>(pendiente)</w:t>
+              <w:t>daviidsierra1422@gmail.com</w:t>
             </w:r>
           </w:p>
         </w:tc>
@@ -799,7 +799,7 @@
           </w:tcPr>
           <w:p>
             <w:r>
-              <w:t>Por definir</w:t>
+              <w:t>Confirmada</w:t>
             </w:r>
           </w:p>
         </w:tc>

</xml_diff>

<commit_message>
docs: asignar nombres de Avila y Santiago en el reparto de trabajo
</commit_message>
<xml_diff>
--- a/REPARTO_FRONTEND.docx
+++ b/REPARTO_FRONTEND.docx
@@ -737,7 +737,7 @@
           </w:tcPr>
           <w:p>
             <w:r>
-              <w:t>(nombre por confirmar)</w:t>
+              <w:t>Avila</w:t>
             </w:r>
           </w:p>
         </w:tc>
@@ -779,7 +779,7 @@
           </w:tcPr>
           <w:p>
             <w:r>
-              <w:t>(nombre por confirmar)</w:t>
+              <w:t>Santiago</w:t>
             </w:r>
           </w:p>
         </w:tc>

</xml_diff>